<commit_message>
S8A-04 CP2: the Product Owner defers S4's remaining case to V2 (Future Improvement 011; amendment §13.10)
A position withdrawn inside the same reading with no replacement may still be saved as current: recorded
as Future Improvement 011 (case, possible effect on social knowledge, V2 direction), a deliberate,
non-blocking limit of the first release, not a fix and not a backlog item. M1 unchanged; no code change,
no paid test. CP2 now at the Product Owner's final gate: the placer binding (still unbound) and the merge.

Co-Authored-By: Claude Opus 5.5 <noreply@anthropic.com>
</commit_message>
<xml_diff>
--- a/docs/future-improvements/QANDEEL_FUTURE_IMPROVEMENTS.docx
+++ b/docs/future-improvements/QANDEEL_FUTURE_IMPROVEMENTS.docx
@@ -3417,6 +3417,370 @@
           <w:rtl/>
         </w:rPr>
         <w:t xml:space="preserve">البديل المسجل في التعديل المعتمد: استرجاع على مستويين، أولًا على مناطق العالم بسطر واحد لكل منطقة، ثم داخل المناطق المختارة، باستدعاء إضافي واحد في العوالم الكبيرة وحدها.</w:t>
+      </w:r>
+    </w:p>
+    <w:p>
+      <w:pPr>
+        <w:pStyle w:val="Heading2"/>
+        <w:bidi/>
+        <w:jc w:val="both"/>
+      </w:pPr>
+      <w:r>
+        <w:rPr>
+          <w:rtl/>
+        </w:rPr>
+        <w:t xml:space="preserve">التحسين </w:t>
+      </w:r>
+      <w:r>
+        <w:rPr/>
+        <w:t xml:space="preserve">011</w:t>
+      </w:r>
+      <w:r>
+        <w:rPr>
+          <w:rtl/>
+        </w:rPr>
+        <w:t xml:space="preserve"> — موقف مسحوب يبقى حاليًا في الذاكرة الاجتماعية المشتركة</w:t>
+      </w:r>
+    </w:p>
+    <w:tbl>
+      <w:tblPr>
+        <w:tblStyle w:val="QTable"/>
+        <w:bidiVisual/>
+        <w:tblW w:w="9026" w:type="dxa"/>
+      </w:tblPr>
+      <w:tblGrid>
+        <w:gridCol w:w="2200"/>
+        <w:gridCol w:w="6826"/>
+      </w:tblGrid>
+      <w:tr>
+        <w:tc>
+          <w:tcPr>
+            <w:tcW w:w="2200" w:type="dxa"/>
+            <w:shd w:val="clear" w:color="auto" w:fill="E8EEF4"/>
+          </w:tcPr>
+          <w:p>
+            <w:pPr>
+              <w:bidi/>
+              <w:spacing w:after="0"/>
+              <w:jc w:val="both"/>
+            </w:pPr>
+            <w:r>
+              <w:rPr>
+                <w:b/>
+                <w:bCs/>
+                <w:rtl/>
+              </w:rPr>
+              <w:t xml:space="preserve">الحالة</w:t>
+            </w:r>
+          </w:p>
+        </w:tc>
+        <w:tc>
+          <w:tcPr>
+            <w:tcW w:w="6826" w:type="dxa"/>
+          </w:tcPr>
+          <w:p>
+            <w:pPr>
+              <w:bidi/>
+              <w:spacing w:after="0"/>
+              <w:jc w:val="both"/>
+            </w:pPr>
+            <w:r>
+              <w:rPr>
+                <w:rtl/>
+              </w:rPr>
+              <w:t xml:space="preserve">قيد معروف مقبول — مؤجل إلى الإصدار الثاني؛ غير مانع لإغلاق </w:t>
+            </w:r>
+            <w:r>
+              <w:rPr/>
+              <w:t xml:space="preserve">CP2</w:t>
+            </w:r>
+            <w:r>
+              <w:rPr>
+                <w:rtl/>
+              </w:rPr>
+              <w:t xml:space="preserve"> أو دمجها</w:t>
+            </w:r>
+          </w:p>
+        </w:tc>
+      </w:tr>
+      <w:tr>
+        <w:tc>
+          <w:tcPr>
+            <w:tcW w:w="2200" w:type="dxa"/>
+            <w:shd w:val="clear" w:color="auto" w:fill="E8EEF4"/>
+          </w:tcPr>
+          <w:p>
+            <w:pPr>
+              <w:bidi/>
+              <w:spacing w:after="0"/>
+              <w:jc w:val="both"/>
+            </w:pPr>
+            <w:r>
+              <w:rPr>
+                <w:b/>
+                <w:bCs/>
+                <w:rtl/>
+              </w:rPr>
+              <w:t xml:space="preserve">المرجع</w:t>
+            </w:r>
+          </w:p>
+        </w:tc>
+        <w:tc>
+          <w:tcPr>
+            <w:tcW w:w="6826" w:type="dxa"/>
+          </w:tcPr>
+          <w:p>
+            <w:pPr>
+              <w:bidi/>
+              <w:spacing w:after="0"/>
+              <w:jc w:val="both"/>
+            </w:pPr>
+            <w:r>
+              <w:rPr/>
+              <w:t xml:space="preserve">S8A-04 CP2</w:t>
+            </w:r>
+            <w:r>
+              <w:rPr>
+                <w:rtl/>
+              </w:rPr>
+              <w:t xml:space="preserve"> — الذاكرة الاجتماعية المشتركة، الحالة </w:t>
+            </w:r>
+            <w:r>
+              <w:rPr/>
+              <w:t xml:space="preserve">S4</w:t>
+            </w:r>
+            <w:r>
+              <w:rPr>
+                <w:rtl/>
+              </w:rPr>
+              <w:t xml:space="preserve"> في الجولة </w:t>
+            </w:r>
+            <w:r>
+              <w:rPr/>
+              <w:t xml:space="preserve">19</w:t>
+            </w:r>
+            <w:r>
+              <w:rPr>
+                <w:rtl/>
+              </w:rPr>
+              <w:t xml:space="preserve"> والجولة التصحيحية الأخيرة</w:t>
+            </w:r>
+          </w:p>
+        </w:tc>
+      </w:tr>
+      <w:tr>
+        <w:tc>
+          <w:tcPr>
+            <w:tcW w:w="2200" w:type="dxa"/>
+            <w:shd w:val="clear" w:color="auto" w:fill="E8EEF4"/>
+          </w:tcPr>
+          <w:p>
+            <w:pPr>
+              <w:bidi/>
+              <w:spacing w:after="0"/>
+              <w:jc w:val="both"/>
+            </w:pPr>
+            <w:r>
+              <w:rPr>
+                <w:b/>
+                <w:bCs/>
+                <w:rtl/>
+              </w:rPr>
+              <w:t xml:space="preserve">تاريخ التسجيل</w:t>
+            </w:r>
+          </w:p>
+        </w:tc>
+        <w:tc>
+          <w:tcPr>
+            <w:tcW w:w="6826" w:type="dxa"/>
+          </w:tcPr>
+          <w:p>
+            <w:pPr>
+              <w:bidi/>
+              <w:spacing w:after="0"/>
+              <w:jc w:val="both"/>
+            </w:pPr>
+            <w:r>
+              <w:rPr/>
+              <w:t xml:space="preserve">2026-10-25</w:t>
+            </w:r>
+          </w:p>
+        </w:tc>
+      </w:tr>
+    </w:tbl>
+    <w:p>
+      <w:pPr>
+        <w:pStyle w:val="Heading3"/>
+        <w:bidi/>
+        <w:jc w:val="both"/>
+      </w:pPr>
+      <w:r>
+        <w:rPr>
+          <w:rtl/>
+        </w:rPr>
+        <w:t xml:space="preserve">وصف مختصر</w:t>
+      </w:r>
+    </w:p>
+    <w:p>
+      <w:pPr>
+        <w:bidi/>
+        <w:jc w:val="both"/>
+      </w:pPr>
+      <w:r>
+        <w:rPr>
+          <w:rtl/>
+        </w:rPr>
+        <w:t xml:space="preserve">إذا سحب أحد الأعضاء موقفه صراحة داخل القراءة نفسها، دون أن يقدّم موقفًا بديلًا، قد يُبقي النموذج ذلك الموقف في قراءته، فيُحفظ في معرفة العالم المشترك باعتباره موقف صاحبه الحالي. لا يرى الخادم السحب إلا حين يترك صاحبه موقفًا أحدث منه.</w:t>
+      </w:r>
+    </w:p>
+    <w:p>
+      <w:pPr>
+        <w:pStyle w:val="Heading3"/>
+        <w:bidi/>
+        <w:jc w:val="both"/>
+      </w:pPr>
+      <w:r>
+        <w:rPr>
+          <w:rtl/>
+        </w:rPr>
+        <w:t xml:space="preserve">الأدلة الحالية</w:t>
+      </w:r>
+    </w:p>
+    <w:p>
+      <w:pPr>
+        <w:bidi/>
+        <w:jc w:val="both"/>
+      </w:pPr>
+      <w:r>
+        <w:rPr>
+          <w:rtl/>
+        </w:rPr>
+        <w:t xml:space="preserve">في الجولة </w:t>
+      </w:r>
+      <w:r>
+        <w:rPr/>
+        <w:t xml:space="preserve">19</w:t>
+      </w:r>
+      <w:r>
+        <w:rPr>
+          <w:rtl/>
+        </w:rPr>
+        <w:t xml:space="preserve"> أبقت قراءة الحالة </w:t>
+      </w:r>
+      <w:r>
+        <w:rPr/>
+        <w:t xml:space="preserve">S4</w:t>
+      </w:r>
+      <w:r>
+        <w:rPr>
+          <w:rtl/>
+        </w:rPr>
+        <w:t xml:space="preserve"> موقفًا سحبه صاحبه، ودمجت موقفه البديل في مكان مشترك مع عضو آخر. أغلقت الجولة التصحيحية الأخيرة هذا الشكل بقاعدة في الخادم: يحتفظ كل عضو بالمكان المأخوذ من أحدث مساهمة له فقط. لكن السحب الصريح الذي لا يتبعه موقف بديل يبقى ممكنًا، لأن إغلاقه يحتاج جملة جديدة في النص المعتمد </w:t>
+      </w:r>
+      <w:r>
+        <w:rPr/>
+        <w:t xml:space="preserve">M1</w:t>
+      </w:r>
+      <w:r>
+        <w:rPr>
+          <w:rtl/>
+        </w:rPr>
+        <w:t xml:space="preserve"> عبر بوابة النصوص.</w:t>
+      </w:r>
+    </w:p>
+    <w:p>
+      <w:pPr>
+        <w:pStyle w:val="Heading3"/>
+        <w:bidi/>
+        <w:jc w:val="both"/>
+      </w:pPr>
+      <w:r>
+        <w:rPr>
+          <w:rtl/>
+        </w:rPr>
+        <w:t xml:space="preserve">الأثر المحتمل</w:t>
+      </w:r>
+    </w:p>
+    <w:p>
+      <w:pPr>
+        <w:bidi/>
+        <w:jc w:val="both"/>
+      </w:pPr>
+      <w:r>
+        <w:rPr>
+          <w:rtl/>
+        </w:rPr>
+        <w:t xml:space="preserve">قد يعرض قنديل على الأعضاء، أو يستحضر في رده، موقفًا تراجع عنه صاحبه كأنه ما زال رأيه، فتفقد المعرفة الاجتماعية دقتها في حق ذلك الشخص. لا يخلط هذا القيد رأي شخصين في معنى واحد، ولا يقدّم رأيًا منقولًا كحقيقة.</w:t>
+      </w:r>
+    </w:p>
+    <w:p>
+      <w:pPr>
+        <w:pStyle w:val="Heading3"/>
+        <w:bidi/>
+        <w:jc w:val="both"/>
+      </w:pPr>
+      <w:r>
+        <w:rPr>
+          <w:rtl/>
+        </w:rPr>
+        <w:t xml:space="preserve">قرار مالك المنتج</w:t>
+      </w:r>
+    </w:p>
+    <w:p>
+      <w:pPr>
+        <w:bidi/>
+        <w:jc w:val="both"/>
+      </w:pPr>
+      <w:r>
+        <w:rPr>
+          <w:rtl/>
+        </w:rPr>
+        <w:t xml:space="preserve">قرر مالك المنتج تأجيل هذه الحالة إلى الإصدار الثاني عن وعي بحدود النسخة الأولى، وقبولها قيدًا معروفًا غير مانع لإغلاق </w:t>
+      </w:r>
+      <w:r>
+        <w:rPr/>
+        <w:t xml:space="preserve">CP2</w:t>
+      </w:r>
+      <w:r>
+        <w:rPr>
+          <w:rtl/>
+        </w:rPr>
+        <w:t xml:space="preserve"> أو دمجها. التأجيل ليس ادعاءً بأن المشكلة أُصلحت. لا تصحيح برمجي لها الآن، ولا اختبارات مدفوعة إضافية بسببها، ولا تعديل للنص المعتمد </w:t>
+      </w:r>
+      <w:r>
+        <w:rPr/>
+        <w:t xml:space="preserve">M1</w:t>
+      </w:r>
+      <w:r>
+        <w:rPr>
+          <w:rtl/>
+        </w:rPr>
+        <w:t xml:space="preserve"> الآن.</w:t>
+      </w:r>
+    </w:p>
+    <w:p>
+      <w:pPr>
+        <w:pStyle w:val="Heading3"/>
+        <w:bidi/>
+        <w:jc w:val="both"/>
+      </w:pPr>
+      <w:r>
+        <w:rPr>
+          <w:rtl/>
+        </w:rPr>
+        <w:t xml:space="preserve">ما نراجعه لاحقًا</w:t>
+      </w:r>
+    </w:p>
+    <w:p>
+      <w:pPr>
+        <w:bidi/>
+        <w:jc w:val="both"/>
+      </w:pPr>
+      <w:r>
+        <w:rPr>
+          <w:rtl/>
+        </w:rPr>
+        <w:t xml:space="preserve">في الإصدار الثاني: التمييز في القراءة بين سحب الموقف وتغييره، وعدم إبقاء موقف مسحوب باعتباره حاليًا، ثم إثبات ذلك بحالات سحب لا يتبعها موقف بديل قبل أي تفعيل.</w:t>
       </w:r>
     </w:p>
     <w:sectPr>

</xml_diff>

<commit_message>
S8A-04 CP2 (post-merge record): S4's remaining case deferred to V2 (Future Improvement 011, amendment §13.10) reaches main; records reconciled to PR #357's merge b0839fd4
Carries the six documentation files of 01100297, prepared on the CP2 branch after PR #357 had been merged as b0839fd4
and so never in main: Future Improvement 011 (once), amendment §13.10 and the locator entries, unchanged in substance.
Reconciled to the merged state, with earlier text kept verbatim: the amendment is EFFECTIVE (merged through PR #357 as
b0839fd4); the placer was unbound at the merge, so CP2 merged as engineering, not as a functionally complete checkpoint;
S8A-04 CP3 (s8a/s8a-04-cp3, from b0839fd4) first completes it. V2's remaining case stays a recorded known limit; no
decision defers it. M1 and S4 are unchanged; no code.

Co-Authored-By: Claude Opus 5.5 <noreply@anthropic.com>
</commit_message>
<xml_diff>
--- a/docs/future-improvements/QANDEEL_FUTURE_IMPROVEMENTS.docx
+++ b/docs/future-improvements/QANDEEL_FUTURE_IMPROVEMENTS.docx
@@ -3417,6 +3417,370 @@
           <w:rtl/>
         </w:rPr>
         <w:t xml:space="preserve">البديل المسجل في التعديل المعتمد: استرجاع على مستويين، أولًا على مناطق العالم بسطر واحد لكل منطقة، ثم داخل المناطق المختارة، باستدعاء إضافي واحد في العوالم الكبيرة وحدها.</w:t>
+      </w:r>
+    </w:p>
+    <w:p>
+      <w:pPr>
+        <w:pStyle w:val="Heading2"/>
+        <w:bidi/>
+        <w:jc w:val="both"/>
+      </w:pPr>
+      <w:r>
+        <w:rPr>
+          <w:rtl/>
+        </w:rPr>
+        <w:t xml:space="preserve">التحسين </w:t>
+      </w:r>
+      <w:r>
+        <w:rPr/>
+        <w:t xml:space="preserve">011</w:t>
+      </w:r>
+      <w:r>
+        <w:rPr>
+          <w:rtl/>
+        </w:rPr>
+        <w:t xml:space="preserve"> — موقف مسحوب يبقى حاليًا في الذاكرة الاجتماعية المشتركة</w:t>
+      </w:r>
+    </w:p>
+    <w:tbl>
+      <w:tblPr>
+        <w:tblStyle w:val="QTable"/>
+        <w:bidiVisual/>
+        <w:tblW w:w="9026" w:type="dxa"/>
+      </w:tblPr>
+      <w:tblGrid>
+        <w:gridCol w:w="2200"/>
+        <w:gridCol w:w="6826"/>
+      </w:tblGrid>
+      <w:tr>
+        <w:tc>
+          <w:tcPr>
+            <w:tcW w:w="2200" w:type="dxa"/>
+            <w:shd w:val="clear" w:color="auto" w:fill="E8EEF4"/>
+          </w:tcPr>
+          <w:p>
+            <w:pPr>
+              <w:bidi/>
+              <w:spacing w:after="0"/>
+              <w:jc w:val="both"/>
+            </w:pPr>
+            <w:r>
+              <w:rPr>
+                <w:b/>
+                <w:bCs/>
+                <w:rtl/>
+              </w:rPr>
+              <w:t xml:space="preserve">الحالة</w:t>
+            </w:r>
+          </w:p>
+        </w:tc>
+        <w:tc>
+          <w:tcPr>
+            <w:tcW w:w="6826" w:type="dxa"/>
+          </w:tcPr>
+          <w:p>
+            <w:pPr>
+              <w:bidi/>
+              <w:spacing w:after="0"/>
+              <w:jc w:val="both"/>
+            </w:pPr>
+            <w:r>
+              <w:rPr>
+                <w:rtl/>
+              </w:rPr>
+              <w:t xml:space="preserve">قيد معروف مقبول — مؤجل إلى الإصدار الثاني؛ غير مانع لإغلاق </w:t>
+            </w:r>
+            <w:r>
+              <w:rPr/>
+              <w:t xml:space="preserve">CP2</w:t>
+            </w:r>
+            <w:r>
+              <w:rPr>
+                <w:rtl/>
+              </w:rPr>
+              <w:t xml:space="preserve"> أو دمجها</w:t>
+            </w:r>
+          </w:p>
+        </w:tc>
+      </w:tr>
+      <w:tr>
+        <w:tc>
+          <w:tcPr>
+            <w:tcW w:w="2200" w:type="dxa"/>
+            <w:shd w:val="clear" w:color="auto" w:fill="E8EEF4"/>
+          </w:tcPr>
+          <w:p>
+            <w:pPr>
+              <w:bidi/>
+              <w:spacing w:after="0"/>
+              <w:jc w:val="both"/>
+            </w:pPr>
+            <w:r>
+              <w:rPr>
+                <w:b/>
+                <w:bCs/>
+                <w:rtl/>
+              </w:rPr>
+              <w:t xml:space="preserve">المرجع</w:t>
+            </w:r>
+          </w:p>
+        </w:tc>
+        <w:tc>
+          <w:tcPr>
+            <w:tcW w:w="6826" w:type="dxa"/>
+          </w:tcPr>
+          <w:p>
+            <w:pPr>
+              <w:bidi/>
+              <w:spacing w:after="0"/>
+              <w:jc w:val="both"/>
+            </w:pPr>
+            <w:r>
+              <w:rPr/>
+              <w:t xml:space="preserve">S8A-04 CP2</w:t>
+            </w:r>
+            <w:r>
+              <w:rPr>
+                <w:rtl/>
+              </w:rPr>
+              <w:t xml:space="preserve"> — الذاكرة الاجتماعية المشتركة، الحالة </w:t>
+            </w:r>
+            <w:r>
+              <w:rPr/>
+              <w:t xml:space="preserve">S4</w:t>
+            </w:r>
+            <w:r>
+              <w:rPr>
+                <w:rtl/>
+              </w:rPr>
+              <w:t xml:space="preserve"> في الجولة </w:t>
+            </w:r>
+            <w:r>
+              <w:rPr/>
+              <w:t xml:space="preserve">19</w:t>
+            </w:r>
+            <w:r>
+              <w:rPr>
+                <w:rtl/>
+              </w:rPr>
+              <w:t xml:space="preserve"> والجولة التصحيحية الأخيرة</w:t>
+            </w:r>
+          </w:p>
+        </w:tc>
+      </w:tr>
+      <w:tr>
+        <w:tc>
+          <w:tcPr>
+            <w:tcW w:w="2200" w:type="dxa"/>
+            <w:shd w:val="clear" w:color="auto" w:fill="E8EEF4"/>
+          </w:tcPr>
+          <w:p>
+            <w:pPr>
+              <w:bidi/>
+              <w:spacing w:after="0"/>
+              <w:jc w:val="both"/>
+            </w:pPr>
+            <w:r>
+              <w:rPr>
+                <w:b/>
+                <w:bCs/>
+                <w:rtl/>
+              </w:rPr>
+              <w:t xml:space="preserve">تاريخ التسجيل</w:t>
+            </w:r>
+          </w:p>
+        </w:tc>
+        <w:tc>
+          <w:tcPr>
+            <w:tcW w:w="6826" w:type="dxa"/>
+          </w:tcPr>
+          <w:p>
+            <w:pPr>
+              <w:bidi/>
+              <w:spacing w:after="0"/>
+              <w:jc w:val="both"/>
+            </w:pPr>
+            <w:r>
+              <w:rPr/>
+              <w:t xml:space="preserve">2026-10-25</w:t>
+            </w:r>
+          </w:p>
+        </w:tc>
+      </w:tr>
+    </w:tbl>
+    <w:p>
+      <w:pPr>
+        <w:pStyle w:val="Heading3"/>
+        <w:bidi/>
+        <w:jc w:val="both"/>
+      </w:pPr>
+      <w:r>
+        <w:rPr>
+          <w:rtl/>
+        </w:rPr>
+        <w:t xml:space="preserve">وصف مختصر</w:t>
+      </w:r>
+    </w:p>
+    <w:p>
+      <w:pPr>
+        <w:bidi/>
+        <w:jc w:val="both"/>
+      </w:pPr>
+      <w:r>
+        <w:rPr>
+          <w:rtl/>
+        </w:rPr>
+        <w:t xml:space="preserve">إذا سحب أحد الأعضاء موقفه صراحة داخل القراءة نفسها، دون أن يقدّم موقفًا بديلًا، قد يُبقي النموذج ذلك الموقف في قراءته، فيُحفظ في معرفة العالم المشترك باعتباره موقف صاحبه الحالي. لا يرى الخادم السحب إلا حين يترك صاحبه موقفًا أحدث منه.</w:t>
+      </w:r>
+    </w:p>
+    <w:p>
+      <w:pPr>
+        <w:pStyle w:val="Heading3"/>
+        <w:bidi/>
+        <w:jc w:val="both"/>
+      </w:pPr>
+      <w:r>
+        <w:rPr>
+          <w:rtl/>
+        </w:rPr>
+        <w:t xml:space="preserve">الأدلة الحالية</w:t>
+      </w:r>
+    </w:p>
+    <w:p>
+      <w:pPr>
+        <w:bidi/>
+        <w:jc w:val="both"/>
+      </w:pPr>
+      <w:r>
+        <w:rPr>
+          <w:rtl/>
+        </w:rPr>
+        <w:t xml:space="preserve">في الجولة </w:t>
+      </w:r>
+      <w:r>
+        <w:rPr/>
+        <w:t xml:space="preserve">19</w:t>
+      </w:r>
+      <w:r>
+        <w:rPr>
+          <w:rtl/>
+        </w:rPr>
+        <w:t xml:space="preserve"> أبقت قراءة الحالة </w:t>
+      </w:r>
+      <w:r>
+        <w:rPr/>
+        <w:t xml:space="preserve">S4</w:t>
+      </w:r>
+      <w:r>
+        <w:rPr>
+          <w:rtl/>
+        </w:rPr>
+        <w:t xml:space="preserve"> موقفًا سحبه صاحبه، ودمجت موقفه البديل في مكان مشترك مع عضو آخر. أغلقت الجولة التصحيحية الأخيرة هذا الشكل بقاعدة في الخادم: يحتفظ كل عضو بالمكان المأخوذ من أحدث مساهمة له فقط. لكن السحب الصريح الذي لا يتبعه موقف بديل يبقى ممكنًا، لأن إغلاقه يحتاج جملة جديدة في النص المعتمد </w:t>
+      </w:r>
+      <w:r>
+        <w:rPr/>
+        <w:t xml:space="preserve">M1</w:t>
+      </w:r>
+      <w:r>
+        <w:rPr>
+          <w:rtl/>
+        </w:rPr>
+        <w:t xml:space="preserve"> عبر بوابة النصوص.</w:t>
+      </w:r>
+    </w:p>
+    <w:p>
+      <w:pPr>
+        <w:pStyle w:val="Heading3"/>
+        <w:bidi/>
+        <w:jc w:val="both"/>
+      </w:pPr>
+      <w:r>
+        <w:rPr>
+          <w:rtl/>
+        </w:rPr>
+        <w:t xml:space="preserve">الأثر المحتمل</w:t>
+      </w:r>
+    </w:p>
+    <w:p>
+      <w:pPr>
+        <w:bidi/>
+        <w:jc w:val="both"/>
+      </w:pPr>
+      <w:r>
+        <w:rPr>
+          <w:rtl/>
+        </w:rPr>
+        <w:t xml:space="preserve">قد يعرض قنديل على الأعضاء، أو يستحضر في رده، موقفًا تراجع عنه صاحبه كأنه ما زال رأيه، فتفقد المعرفة الاجتماعية دقتها في حق ذلك الشخص. لا يخلط هذا القيد رأي شخصين في معنى واحد، ولا يقدّم رأيًا منقولًا كحقيقة.</w:t>
+      </w:r>
+    </w:p>
+    <w:p>
+      <w:pPr>
+        <w:pStyle w:val="Heading3"/>
+        <w:bidi/>
+        <w:jc w:val="both"/>
+      </w:pPr>
+      <w:r>
+        <w:rPr>
+          <w:rtl/>
+        </w:rPr>
+        <w:t xml:space="preserve">قرار مالك المنتج</w:t>
+      </w:r>
+    </w:p>
+    <w:p>
+      <w:pPr>
+        <w:bidi/>
+        <w:jc w:val="both"/>
+      </w:pPr>
+      <w:r>
+        <w:rPr>
+          <w:rtl/>
+        </w:rPr>
+        <w:t xml:space="preserve">قرر مالك المنتج تأجيل هذه الحالة إلى الإصدار الثاني عن وعي بحدود النسخة الأولى، وقبولها قيدًا معروفًا غير مانع لإغلاق </w:t>
+      </w:r>
+      <w:r>
+        <w:rPr/>
+        <w:t xml:space="preserve">CP2</w:t>
+      </w:r>
+      <w:r>
+        <w:rPr>
+          <w:rtl/>
+        </w:rPr>
+        <w:t xml:space="preserve"> أو دمجها. التأجيل ليس ادعاءً بأن المشكلة أُصلحت. لا تصحيح برمجي لها الآن، ولا اختبارات مدفوعة إضافية بسببها، ولا تعديل للنص المعتمد </w:t>
+      </w:r>
+      <w:r>
+        <w:rPr/>
+        <w:t xml:space="preserve">M1</w:t>
+      </w:r>
+      <w:r>
+        <w:rPr>
+          <w:rtl/>
+        </w:rPr>
+        <w:t xml:space="preserve"> الآن.</w:t>
+      </w:r>
+    </w:p>
+    <w:p>
+      <w:pPr>
+        <w:pStyle w:val="Heading3"/>
+        <w:bidi/>
+        <w:jc w:val="both"/>
+      </w:pPr>
+      <w:r>
+        <w:rPr>
+          <w:rtl/>
+        </w:rPr>
+        <w:t xml:space="preserve">ما نراجعه لاحقًا</w:t>
+      </w:r>
+    </w:p>
+    <w:p>
+      <w:pPr>
+        <w:bidi/>
+        <w:jc w:val="both"/>
+      </w:pPr>
+      <w:r>
+        <w:rPr>
+          <w:rtl/>
+        </w:rPr>
+        <w:t xml:space="preserve">في الإصدار الثاني: التمييز في القراءة بين سحب الموقف وتغييره، وعدم إبقاء موقف مسحوب باعتباره حاليًا، ثم إثبات ذلك بحالات سحب لا يتبعها موقف بديل قبل أي تفعيل.</w:t>
       </w:r>
     </w:p>
     <w:sectPr>

</xml_diff>